<commit_message>
update README and uploaded .ris files
</commit_message>
<xml_diff>
--- a/protocol_logbook.docx
+++ b/protocol_logbook.docx
@@ -4304,6 +4304,35 @@
     <w:p>
       <w:pPr>
         <w:numPr>
+          <w:ilvl w:val="0"/>
+          <w:numId w:val="2"/>
+        </w:numPr>
+        <w:pBdr>
+          <w:top w:val="nil"/>
+          <w:left w:val="nil"/>
+          <w:bottom w:val="nil"/>
+          <w:right w:val="nil"/>
+          <w:between w:val="nil"/>
+        </w:pBdr>
+        <w:spacing w:after="0"/>
+        <w:rPr>
+          <w:color w:val="FF0000"/>
+          <w:sz w:val="22"/>
+          <w:szCs w:val="22"/>
+        </w:rPr>
+      </w:pPr>
+      <w:r>
+        <w:rPr>
+          <w:color w:val="FF0000"/>
+          <w:sz w:val="22"/>
+          <w:szCs w:val="22"/>
+        </w:rPr>
+        <w:t>Full text screening restarted on 25.03.2026 (stopped at Rogers, 2025)</w:t>
+      </w:r>
+    </w:p>
+    <w:p>
+      <w:pPr>
+        <w:numPr>
           <w:ilvl w:val="1"/>
           <w:numId w:val="2"/>
         </w:numPr>
@@ -4327,7 +4356,15 @@
           <w:sz w:val="22"/>
           <w:szCs w:val="22"/>
         </w:rPr>
-        <w:t>One snowballed record was added: Bleier (2025)</w:t>
+        <w:t>Three</w:t>
+      </w:r>
+      <w:r>
+        <w:rPr>
+          <w:color w:val="FF0000"/>
+          <w:sz w:val="22"/>
+          <w:szCs w:val="22"/>
+        </w:rPr>
+        <w:t xml:space="preserve"> backward snowballed records were added: Knöpfle &amp; Schatto-Eckrodt (2024); Whitehouse et al. (2019); and Hayden et al. (2023)</w:t>
       </w:r>
     </w:p>
     <w:p>
@@ -4356,7 +4393,36 @@
           <w:sz w:val="22"/>
           <w:szCs w:val="22"/>
         </w:rPr>
-        <w:t>Full text screening restarted on 25.03.2026 (stopped at Rogers, 2025)</w:t>
+        <w:t>Full text screening restarted on 26.03.2026 (stopped at Šimko, 2025)</w:t>
+      </w:r>
+    </w:p>
+    <w:p>
+      <w:pPr>
+        <w:numPr>
+          <w:ilvl w:val="0"/>
+          <w:numId w:val="2"/>
+        </w:numPr>
+        <w:pBdr>
+          <w:top w:val="nil"/>
+          <w:left w:val="nil"/>
+          <w:bottom w:val="nil"/>
+          <w:right w:val="nil"/>
+          <w:between w:val="nil"/>
+        </w:pBdr>
+        <w:spacing w:after="0"/>
+        <w:rPr>
+          <w:color w:val="FF0000"/>
+          <w:sz w:val="22"/>
+          <w:szCs w:val="22"/>
+        </w:rPr>
+      </w:pPr>
+      <w:r>
+        <w:rPr>
+          <w:color w:val="FF0000"/>
+          <w:sz w:val="22"/>
+          <w:szCs w:val="22"/>
+        </w:rPr>
+        <w:t xml:space="preserve">Full text screening restarted and completed on 27.03.2026 </w:t>
       </w:r>
     </w:p>
     <w:p>
@@ -4385,93 +4451,6 @@
           <w:sz w:val="22"/>
           <w:szCs w:val="22"/>
         </w:rPr>
-        <w:t>Two backward snowballed records were added: Knöpfle &amp; Schatto-Eckrodt (2024); Whitehouse et al. (2019); and Hayden et al. (2023)</w:t>
-      </w:r>
-    </w:p>
-    <w:p>
-      <w:pPr>
-        <w:numPr>
-          <w:ilvl w:val="0"/>
-          <w:numId w:val="2"/>
-        </w:numPr>
-        <w:pBdr>
-          <w:top w:val="nil"/>
-          <w:left w:val="nil"/>
-          <w:bottom w:val="nil"/>
-          <w:right w:val="nil"/>
-          <w:between w:val="nil"/>
-        </w:pBdr>
-        <w:spacing w:after="0"/>
-        <w:rPr>
-          <w:color w:val="FF0000"/>
-          <w:sz w:val="22"/>
-          <w:szCs w:val="22"/>
-        </w:rPr>
-      </w:pPr>
-      <w:r>
-        <w:rPr>
-          <w:color w:val="FF0000"/>
-          <w:sz w:val="22"/>
-          <w:szCs w:val="22"/>
-        </w:rPr>
-        <w:t>Full text screening restarted on 26.03.2026 (stopped at Šimko, 2025)</w:t>
-      </w:r>
-    </w:p>
-    <w:p>
-      <w:pPr>
-        <w:numPr>
-          <w:ilvl w:val="0"/>
-          <w:numId w:val="2"/>
-        </w:numPr>
-        <w:pBdr>
-          <w:top w:val="nil"/>
-          <w:left w:val="nil"/>
-          <w:bottom w:val="nil"/>
-          <w:right w:val="nil"/>
-          <w:between w:val="nil"/>
-        </w:pBdr>
-        <w:spacing w:after="0"/>
-        <w:rPr>
-          <w:color w:val="FF0000"/>
-          <w:sz w:val="22"/>
-          <w:szCs w:val="22"/>
-        </w:rPr>
-      </w:pPr>
-      <w:r>
-        <w:rPr>
-          <w:color w:val="FF0000"/>
-          <w:sz w:val="22"/>
-          <w:szCs w:val="22"/>
-        </w:rPr>
-        <w:t xml:space="preserve">Full text screening restarted and completed on 27.03.2026 </w:t>
-      </w:r>
-    </w:p>
-    <w:p>
-      <w:pPr>
-        <w:numPr>
-          <w:ilvl w:val="1"/>
-          <w:numId w:val="2"/>
-        </w:numPr>
-        <w:pBdr>
-          <w:top w:val="nil"/>
-          <w:left w:val="nil"/>
-          <w:bottom w:val="nil"/>
-          <w:right w:val="nil"/>
-          <w:between w:val="nil"/>
-        </w:pBdr>
-        <w:spacing w:after="0"/>
-        <w:rPr>
-          <w:color w:val="FF0000"/>
-          <w:sz w:val="22"/>
-          <w:szCs w:val="22"/>
-        </w:rPr>
-      </w:pPr>
-      <w:r>
-        <w:rPr>
-          <w:color w:val="FF0000"/>
-          <w:sz w:val="22"/>
-          <w:szCs w:val="22"/>
-        </w:rPr>
         <w:t>Two backward snowballed records were added: Vilhuber, et al. (2022) &amp; Horbach et al. (2026)</w:t>
       </w:r>
     </w:p>
@@ -4704,7 +4683,6 @@
           <w:sz w:val="22"/>
           <w:szCs w:val="22"/>
         </w:rPr>
-        <w:lastRenderedPageBreak/>
         <w:t>Forward snowballing</w:t>
       </w:r>
       <w:r>
@@ -5025,6 +5003,31 @@
           <w:szCs w:val="22"/>
         </w:rPr>
         <w:t>All of them have already been included in Step 3 search.</w:t>
+      </w:r>
+    </w:p>
+    <w:p>
+      <w:pPr>
+        <w:pBdr>
+          <w:top w:val="nil"/>
+          <w:left w:val="nil"/>
+          <w:bottom w:val="nil"/>
+          <w:right w:val="nil"/>
+          <w:between w:val="nil"/>
+        </w:pBdr>
+        <w:ind w:left="720"/>
+        <w:rPr>
+          <w:color w:val="FF0000"/>
+          <w:sz w:val="22"/>
+          <w:szCs w:val="22"/>
+        </w:rPr>
+      </w:pPr>
+      <w:r>
+        <w:rPr>
+          <w:color w:val="FF0000"/>
+          <w:sz w:val="22"/>
+          <w:szCs w:val="22"/>
+        </w:rPr>
+        <w:t>One new record added from GESIS Working Papers – Bleier (2025)</w:t>
       </w:r>
     </w:p>
     <w:p>

</xml_diff>

<commit_message>
criteria extraction done, analysis is ongoing
</commit_message>
<xml_diff>
--- a/protocol_logbook.docx
+++ b/protocol_logbook.docx
@@ -6879,7 +6879,7 @@
     </w:p>
     <w:p>
       <w:pPr>
-        <w:pStyle w:val="ListParagraph"/>
+        <w:pStyle w:val="Listenabsatz"/>
         <w:numPr>
           <w:ilvl w:val="3"/>
           <w:numId w:val="2"/>
@@ -6922,7 +6922,7 @@
     </w:p>
     <w:p>
       <w:pPr>
-        <w:pStyle w:val="ListParagraph"/>
+        <w:pStyle w:val="Listenabsatz"/>
         <w:numPr>
           <w:ilvl w:val="3"/>
           <w:numId w:val="2"/>
@@ -7102,7 +7102,7 @@
     </w:p>
     <w:p>
       <w:pPr>
-        <w:pStyle w:val="ListParagraph"/>
+        <w:pStyle w:val="Listenabsatz"/>
         <w:numPr>
           <w:ilvl w:val="6"/>
           <w:numId w:val="2"/>
@@ -7138,7 +7138,7 @@
     </w:p>
     <w:p>
       <w:pPr>
-        <w:pStyle w:val="ListParagraph"/>
+        <w:pStyle w:val="Listenabsatz"/>
         <w:numPr>
           <w:ilvl w:val="7"/>
           <w:numId w:val="2"/>
@@ -7223,7 +7223,7 @@
     </w:p>
     <w:p>
       <w:pPr>
-        <w:pStyle w:val="ListParagraph"/>
+        <w:pStyle w:val="Listenabsatz"/>
         <w:numPr>
           <w:ilvl w:val="7"/>
           <w:numId w:val="2"/>
@@ -7280,7 +7280,7 @@
     </w:p>
     <w:p>
       <w:pPr>
-        <w:pStyle w:val="ListParagraph"/>
+        <w:pStyle w:val="Listenabsatz"/>
         <w:numPr>
           <w:ilvl w:val="7"/>
           <w:numId w:val="2"/>
@@ -7337,7 +7337,7 @@
     </w:p>
     <w:p>
       <w:pPr>
-        <w:pStyle w:val="ListParagraph"/>
+        <w:pStyle w:val="Listenabsatz"/>
         <w:numPr>
           <w:ilvl w:val="7"/>
           <w:numId w:val="2"/>
@@ -7366,7 +7366,7 @@
     </w:p>
     <w:p>
       <w:pPr>
-        <w:pStyle w:val="ListParagraph"/>
+        <w:pStyle w:val="Listenabsatz"/>
         <w:pBdr>
           <w:top w:val="nil"/>
           <w:left w:val="nil"/>
@@ -7384,7 +7384,7 @@
     </w:p>
     <w:p>
       <w:pPr>
-        <w:pStyle w:val="ListParagraph"/>
+        <w:pStyle w:val="Listenabsatz"/>
         <w:numPr>
           <w:ilvl w:val="6"/>
           <w:numId w:val="2"/>
@@ -7413,7 +7413,7 @@
     </w:p>
     <w:p>
       <w:pPr>
-        <w:pStyle w:val="ListParagraph"/>
+        <w:pStyle w:val="Listenabsatz"/>
         <w:numPr>
           <w:ilvl w:val="7"/>
           <w:numId w:val="2"/>
@@ -7477,7 +7477,7 @@
     </w:p>
     <w:p>
       <w:pPr>
-        <w:pStyle w:val="ListParagraph"/>
+        <w:pStyle w:val="Listenabsatz"/>
         <w:numPr>
           <w:ilvl w:val="7"/>
           <w:numId w:val="2"/>
@@ -7549,7 +7549,7 @@
     </w:p>
     <w:p>
       <w:pPr>
-        <w:pStyle w:val="ListParagraph"/>
+        <w:pStyle w:val="Listenabsatz"/>
         <w:numPr>
           <w:ilvl w:val="7"/>
           <w:numId w:val="2"/>
@@ -7578,7 +7578,7 @@
     </w:p>
     <w:p>
       <w:pPr>
-        <w:pStyle w:val="ListParagraph"/>
+        <w:pStyle w:val="Listenabsatz"/>
         <w:pBdr>
           <w:top w:val="nil"/>
           <w:left w:val="nil"/>
@@ -7596,7 +7596,7 @@
     </w:p>
     <w:p>
       <w:pPr>
-        <w:pStyle w:val="ListParagraph"/>
+        <w:pStyle w:val="Listenabsatz"/>
         <w:numPr>
           <w:ilvl w:val="6"/>
           <w:numId w:val="2"/>
@@ -7625,7 +7625,7 @@
     </w:p>
     <w:p>
       <w:pPr>
-        <w:pStyle w:val="ListParagraph"/>
+        <w:pStyle w:val="Listenabsatz"/>
         <w:numPr>
           <w:ilvl w:val="7"/>
           <w:numId w:val="2"/>
@@ -7710,7 +7710,7 @@
     </w:p>
     <w:p>
       <w:pPr>
-        <w:pStyle w:val="ListParagraph"/>
+        <w:pStyle w:val="Listenabsatz"/>
         <w:numPr>
           <w:ilvl w:val="7"/>
           <w:numId w:val="2"/>
@@ -7753,7 +7753,7 @@
     </w:p>
     <w:p>
       <w:pPr>
-        <w:pStyle w:val="ListParagraph"/>
+        <w:pStyle w:val="Listenabsatz"/>
         <w:numPr>
           <w:ilvl w:val="7"/>
           <w:numId w:val="2"/>
@@ -7847,7 +7847,7 @@
     </w:p>
     <w:p>
       <w:pPr>
-        <w:pStyle w:val="ListParagraph"/>
+        <w:pStyle w:val="Listenabsatz"/>
         <w:numPr>
           <w:ilvl w:val="7"/>
           <w:numId w:val="2"/>
@@ -7890,7 +7890,7 @@
     </w:p>
     <w:p>
       <w:pPr>
-        <w:pStyle w:val="ListParagraph"/>
+        <w:pStyle w:val="Listenabsatz"/>
         <w:numPr>
           <w:ilvl w:val="7"/>
           <w:numId w:val="2"/>
@@ -7926,7 +7926,7 @@
     </w:p>
     <w:p>
       <w:pPr>
-        <w:pStyle w:val="ListParagraph"/>
+        <w:pStyle w:val="Listenabsatz"/>
         <w:pBdr>
           <w:top w:val="nil"/>
           <w:left w:val="nil"/>
@@ -7944,7 +7944,7 @@
     </w:p>
     <w:p>
       <w:pPr>
-        <w:pStyle w:val="ListParagraph"/>
+        <w:pStyle w:val="Listenabsatz"/>
         <w:numPr>
           <w:ilvl w:val="6"/>
           <w:numId w:val="2"/>
@@ -8809,7 +8809,7 @@
             <w:commentRangeEnd w:id="0"/>
             <w:r>
               <w:rPr>
-                <w:rStyle w:val="CommentReference"/>
+                <w:rStyle w:val="Kommentarzeichen"/>
                 <w:color w:val="000000"/>
                 <w:sz w:val="20"/>
                 <w:szCs w:val="20"/>
@@ -8819,7 +8819,7 @@
             <w:commentRangeEnd w:id="1"/>
             <w:r>
               <w:rPr>
-                <w:rStyle w:val="CommentReference"/>
+                <w:rStyle w:val="Kommentarzeichen"/>
                 <w:color w:val="000000"/>
                 <w:sz w:val="20"/>
                 <w:szCs w:val="20"/>
@@ -8829,7 +8829,7 @@
             <w:commentRangeEnd w:id="2"/>
             <w:r>
               <w:rPr>
-                <w:rStyle w:val="CommentReference"/>
+                <w:rStyle w:val="Kommentarzeichen"/>
                 <w:color w:val="000000"/>
                 <w:sz w:val="20"/>
                 <w:szCs w:val="20"/>
@@ -9012,7 +9012,7 @@
     </w:p>
     <w:p>
       <w:pPr>
-        <w:pStyle w:val="ListParagraph"/>
+        <w:pStyle w:val="Listenabsatz"/>
         <w:numPr>
           <w:ilvl w:val="3"/>
           <w:numId w:val="10"/>
@@ -9277,7 +9277,7 @@
       <w:commentRangeEnd w:id="3"/>
       <w:r>
         <w:rPr>
-          <w:rStyle w:val="CommentReference"/>
+          <w:rStyle w:val="Kommentarzeichen"/>
           <w:sz w:val="22"/>
           <w:szCs w:val="22"/>
         </w:rPr>
@@ -9286,7 +9286,7 @@
       <w:commentRangeEnd w:id="4"/>
       <w:r>
         <w:rPr>
-          <w:rStyle w:val="CommentReference"/>
+          <w:rStyle w:val="Kommentarzeichen"/>
           <w:sz w:val="22"/>
           <w:szCs w:val="22"/>
         </w:rPr>
@@ -9968,7 +9968,7 @@
     </w:p>
     <w:tbl>
       <w:tblPr>
-        <w:tblStyle w:val="TableGrid"/>
+        <w:tblStyle w:val="Tabellenraster"/>
         <w:tblW w:w="0" w:type="auto"/>
         <w:tblLook w:val="04A0" w:firstRow="1" w:lastRow="0" w:firstColumn="1" w:lastColumn="0" w:noHBand="0" w:noVBand="1"/>
       </w:tblPr>
@@ -11822,6 +11822,90 @@
         <w:t>Issues with sensitive/proprietary data</w:t>
       </w:r>
     </w:p>
+    <w:p>
+      <w:pPr>
+        <w:pBdr>
+          <w:top w:val="nil"/>
+          <w:left w:val="nil"/>
+          <w:bottom w:val="nil"/>
+          <w:right w:val="nil"/>
+          <w:between w:val="nil"/>
+        </w:pBdr>
+        <w:spacing w:after="0"/>
+        <w:rPr>
+          <w:color w:val="000000"/>
+          <w:sz w:val="22"/>
+          <w:szCs w:val="22"/>
+        </w:rPr>
+      </w:pPr>
+    </w:p>
+    <w:p>
+      <w:pPr>
+        <w:pBdr>
+          <w:top w:val="nil"/>
+          <w:left w:val="nil"/>
+          <w:bottom w:val="nil"/>
+          <w:right w:val="nil"/>
+          <w:between w:val="nil"/>
+        </w:pBdr>
+        <w:spacing w:after="0"/>
+        <w:rPr>
+          <w:color w:val="000000"/>
+          <w:sz w:val="22"/>
+          <w:szCs w:val="22"/>
+        </w:rPr>
+      </w:pPr>
+    </w:p>
+    <w:p>
+      <w:pPr>
+        <w:pBdr>
+          <w:top w:val="nil"/>
+          <w:left w:val="nil"/>
+          <w:bottom w:val="nil"/>
+          <w:right w:val="nil"/>
+          <w:between w:val="nil"/>
+        </w:pBdr>
+        <w:spacing w:after="0"/>
+        <w:rPr>
+          <w:color w:val="000000"/>
+          <w:sz w:val="22"/>
+          <w:szCs w:val="22"/>
+        </w:rPr>
+      </w:pPr>
+    </w:p>
+    <w:p>
+      <w:pPr>
+        <w:pBdr>
+          <w:top w:val="nil"/>
+          <w:left w:val="nil"/>
+          <w:bottom w:val="nil"/>
+          <w:right w:val="nil"/>
+          <w:between w:val="nil"/>
+        </w:pBdr>
+        <w:spacing w:after="0"/>
+        <w:rPr>
+          <w:color w:val="000000"/>
+          <w:sz w:val="22"/>
+          <w:szCs w:val="22"/>
+        </w:rPr>
+      </w:pPr>
+    </w:p>
+    <w:p>
+      <w:pPr>
+        <w:pBdr>
+          <w:top w:val="nil"/>
+          <w:left w:val="nil"/>
+          <w:bottom w:val="nil"/>
+          <w:right w:val="nil"/>
+          <w:between w:val="nil"/>
+        </w:pBdr>
+        <w:spacing w:after="0"/>
+        <w:rPr>
+          <w:sz w:val="22"/>
+          <w:szCs w:val="22"/>
+        </w:rPr>
+      </w:pPr>
+    </w:p>
     <w:sectPr>
       <w:pgSz w:w="11906" w:h="16838"/>
       <w:pgMar w:top="1417" w:right="1417" w:bottom="851" w:left="1417" w:header="708" w:footer="708" w:gutter="0"/>
@@ -11855,7 +11939,7 @@
       </w:pPr>
       <w:r>
         <w:rPr>
-          <w:rStyle w:val="CommentReference"/>
+          <w:rStyle w:val="Kommentarzeichen"/>
         </w:rPr>
         <w:annotationRef/>
       </w:r>
@@ -11985,7 +12069,7 @@
       </w:pPr>
       <w:r>
         <w:rPr>
-          <w:rStyle w:val="CommentReference"/>
+          <w:rStyle w:val="Kommentarzeichen"/>
         </w:rPr>
         <w:annotationRef/>
       </w:r>
@@ -12087,11 +12171,11 @@
   <w:comment w:id="2" w:author="Amelia Zein" w:date="2026-05-05T08:35:00Z" w:initials="AZ">
     <w:p>
       <w:pPr>
-        <w:pStyle w:val="CommentText"/>
-      </w:pPr>
-      <w:r>
-        <w:rPr>
-          <w:rStyle w:val="CommentReference"/>
+        <w:pStyle w:val="Kommentartext"/>
+      </w:pPr>
+      <w:r>
+        <w:rPr>
+          <w:rStyle w:val="Kommentarzeichen"/>
         </w:rPr>
         <w:annotationRef/>
       </w:r>
@@ -12121,7 +12205,7 @@
       </w:pPr>
       <w:r>
         <w:rPr>
-          <w:rStyle w:val="CommentReference"/>
+          <w:rStyle w:val="Kommentarzeichen"/>
         </w:rPr>
         <w:annotationRef/>
       </w:r>
@@ -12139,11 +12223,11 @@
   <w:comment w:id="4" w:author="Amelia Zein" w:date="2026-05-05T08:17:00Z" w:initials="AZ">
     <w:p>
       <w:pPr>
-        <w:pStyle w:val="CommentText"/>
-      </w:pPr>
-      <w:r>
-        <w:rPr>
-          <w:rStyle w:val="CommentReference"/>
+        <w:pStyle w:val="Kommentartext"/>
+      </w:pPr>
+      <w:r>
+        <w:rPr>
+          <w:rStyle w:val="Kommentarzeichen"/>
         </w:rPr>
         <w:annotationRef/>
       </w:r>
@@ -13649,14 +13733,14 @@
     <w:lsdException w:name="Unresolved Mention" w:semiHidden="1" w:unhideWhenUsed="1"/>
     <w:lsdException w:name="Smart Link" w:semiHidden="1" w:unhideWhenUsed="1"/>
   </w:latentStyles>
-  <w:style w:type="paragraph" w:default="1" w:styleId="Normal">
+  <w:style w:type="paragraph" w:default="1" w:styleId="Standard">
     <w:name w:val="Normal"/>
     <w:qFormat/>
   </w:style>
-  <w:style w:type="paragraph" w:styleId="Heading1">
+  <w:style w:type="paragraph" w:styleId="berschrift1">
     <w:name w:val="heading 1"/>
-    <w:basedOn w:val="Normal"/>
-    <w:next w:val="Normal"/>
+    <w:basedOn w:val="Standard"/>
+    <w:next w:val="Standard"/>
     <w:uiPriority w:val="9"/>
     <w:qFormat/>
     <w:pPr>
@@ -13672,10 +13756,10 @@
       <w:szCs w:val="40"/>
     </w:rPr>
   </w:style>
-  <w:style w:type="paragraph" w:styleId="Heading2">
+  <w:style w:type="paragraph" w:styleId="berschrift2">
     <w:name w:val="heading 2"/>
-    <w:basedOn w:val="Normal"/>
-    <w:next w:val="Normal"/>
+    <w:basedOn w:val="Standard"/>
+    <w:next w:val="Standard"/>
     <w:uiPriority w:val="9"/>
     <w:semiHidden/>
     <w:unhideWhenUsed/>
@@ -13693,10 +13777,10 @@
       <w:szCs w:val="32"/>
     </w:rPr>
   </w:style>
-  <w:style w:type="paragraph" w:styleId="Heading3">
+  <w:style w:type="paragraph" w:styleId="berschrift3">
     <w:name w:val="heading 3"/>
-    <w:basedOn w:val="Normal"/>
-    <w:next w:val="Normal"/>
+    <w:basedOn w:val="Standard"/>
+    <w:next w:val="Standard"/>
     <w:uiPriority w:val="9"/>
     <w:semiHidden/>
     <w:unhideWhenUsed/>
@@ -13713,10 +13797,10 @@
       <w:szCs w:val="28"/>
     </w:rPr>
   </w:style>
-  <w:style w:type="paragraph" w:styleId="Heading4">
+  <w:style w:type="paragraph" w:styleId="berschrift4">
     <w:name w:val="heading 4"/>
-    <w:basedOn w:val="Normal"/>
-    <w:next w:val="Normal"/>
+    <w:basedOn w:val="Standard"/>
+    <w:next w:val="Standard"/>
     <w:uiPriority w:val="9"/>
     <w:semiHidden/>
     <w:unhideWhenUsed/>
@@ -13733,10 +13817,10 @@
       <w:color w:val="0F4761"/>
     </w:rPr>
   </w:style>
-  <w:style w:type="paragraph" w:styleId="Heading5">
+  <w:style w:type="paragraph" w:styleId="berschrift5">
     <w:name w:val="heading 5"/>
-    <w:basedOn w:val="Normal"/>
-    <w:next w:val="Normal"/>
+    <w:basedOn w:val="Standard"/>
+    <w:next w:val="Standard"/>
     <w:uiPriority w:val="9"/>
     <w:semiHidden/>
     <w:unhideWhenUsed/>
@@ -13751,10 +13835,10 @@
       <w:color w:val="0F4761"/>
     </w:rPr>
   </w:style>
-  <w:style w:type="paragraph" w:styleId="Heading6">
+  <w:style w:type="paragraph" w:styleId="berschrift6">
     <w:name w:val="heading 6"/>
-    <w:basedOn w:val="Normal"/>
-    <w:next w:val="Normal"/>
+    <w:basedOn w:val="Standard"/>
+    <w:next w:val="Standard"/>
     <w:uiPriority w:val="9"/>
     <w:semiHidden/>
     <w:unhideWhenUsed/>
@@ -13771,13 +13855,13 @@
       <w:color w:val="595959"/>
     </w:rPr>
   </w:style>
-  <w:style w:type="character" w:default="1" w:styleId="DefaultParagraphFont">
+  <w:style w:type="character" w:default="1" w:styleId="Absatz-Standardschriftart">
     <w:name w:val="Default Paragraph Font"/>
     <w:uiPriority w:val="1"/>
     <w:semiHidden/>
     <w:unhideWhenUsed/>
   </w:style>
-  <w:style w:type="table" w:default="1" w:styleId="TableNormal">
+  <w:style w:type="table" w:default="1" w:styleId="NormaleTabelle">
     <w:name w:val="Normal Table"/>
     <w:uiPriority w:val="99"/>
     <w:semiHidden/>
@@ -13792,13 +13876,13 @@
       </w:tblCellMar>
     </w:tblPr>
   </w:style>
-  <w:style w:type="numbering" w:default="1" w:styleId="NoList">
+  <w:style w:type="numbering" w:default="1" w:styleId="KeineListe">
     <w:name w:val="No List"/>
     <w:uiPriority w:val="99"/>
     <w:semiHidden/>
     <w:unhideWhenUsed/>
   </w:style>
-  <w:style w:type="table" w:customStyle="1" w:styleId="TableNormal0">
+  <w:style w:type="table" w:customStyle="1" w:styleId="TableNormal">
     <w:name w:val="TableNormal"/>
     <w:tblPr>
       <w:tblCellMar>
@@ -13809,10 +13893,10 @@
       </w:tblCellMar>
     </w:tblPr>
   </w:style>
-  <w:style w:type="paragraph" w:styleId="Title">
+  <w:style w:type="paragraph" w:styleId="Titel">
     <w:name w:val="Title"/>
-    <w:basedOn w:val="Normal"/>
-    <w:next w:val="Normal"/>
+    <w:basedOn w:val="Standard"/>
+    <w:next w:val="Standard"/>
     <w:uiPriority w:val="10"/>
     <w:qFormat/>
     <w:pPr>
@@ -13824,10 +13908,10 @@
       <w:szCs w:val="56"/>
     </w:rPr>
   </w:style>
-  <w:style w:type="paragraph" w:styleId="Subtitle">
+  <w:style w:type="paragraph" w:styleId="Untertitel">
     <w:name w:val="Subtitle"/>
-    <w:basedOn w:val="Normal"/>
-    <w:next w:val="Normal"/>
+    <w:basedOn w:val="Standard"/>
+    <w:next w:val="Standard"/>
     <w:uiPriority w:val="11"/>
     <w:qFormat/>
     <w:rPr>
@@ -13837,7 +13921,7 @@
     </w:rPr>
   </w:style>
   <w:style w:type="table" w:customStyle="1" w:styleId="a">
-    <w:basedOn w:val="TableNormal0"/>
+    <w:basedOn w:val="TableNormal"/>
     <w:tblPr>
       <w:tblStyleRowBandSize w:val="1"/>
       <w:tblStyleColBandSize w:val="1"/>
@@ -13850,7 +13934,7 @@
     </w:tblPr>
   </w:style>
   <w:style w:type="table" w:customStyle="1" w:styleId="a0">
-    <w:basedOn w:val="TableNormal0"/>
+    <w:basedOn w:val="TableNormal"/>
     <w:tblPr>
       <w:tblStyleRowBandSize w:val="1"/>
       <w:tblStyleColBandSize w:val="1"/>
@@ -13863,7 +13947,7 @@
     </w:tblPr>
   </w:style>
   <w:style w:type="table" w:customStyle="1" w:styleId="a1">
-    <w:basedOn w:val="TableNormal0"/>
+    <w:basedOn w:val="TableNormal"/>
     <w:tblPr>
       <w:tblStyleRowBandSize w:val="1"/>
       <w:tblStyleColBandSize w:val="1"/>
@@ -13876,7 +13960,7 @@
     </w:tblPr>
   </w:style>
   <w:style w:type="table" w:customStyle="1" w:styleId="a2">
-    <w:basedOn w:val="TableNormal0"/>
+    <w:basedOn w:val="TableNormal"/>
     <w:pPr>
       <w:spacing w:after="0" w:line="240" w:lineRule="auto"/>
     </w:pPr>
@@ -13891,10 +13975,10 @@
       </w:tblCellMar>
     </w:tblPr>
   </w:style>
-  <w:style w:type="paragraph" w:styleId="CommentText">
+  <w:style w:type="paragraph" w:styleId="Kommentartext">
     <w:name w:val="annotation text"/>
-    <w:basedOn w:val="Normal"/>
-    <w:link w:val="CommentTextChar"/>
+    <w:basedOn w:val="Standard"/>
+    <w:link w:val="KommentartextZchn"/>
     <w:uiPriority w:val="99"/>
     <w:unhideWhenUsed/>
     <w:pPr>
@@ -13905,19 +13989,19 @@
       <w:szCs w:val="20"/>
     </w:rPr>
   </w:style>
-  <w:style w:type="character" w:customStyle="1" w:styleId="CommentTextChar">
-    <w:name w:val="Comment Text Char"/>
-    <w:basedOn w:val="DefaultParagraphFont"/>
-    <w:link w:val="CommentText"/>
+  <w:style w:type="character" w:customStyle="1" w:styleId="KommentartextZchn">
+    <w:name w:val="Kommentartext Zchn"/>
+    <w:basedOn w:val="Absatz-Standardschriftart"/>
+    <w:link w:val="Kommentartext"/>
     <w:uiPriority w:val="99"/>
     <w:rPr>
       <w:sz w:val="20"/>
       <w:szCs w:val="20"/>
     </w:rPr>
   </w:style>
-  <w:style w:type="character" w:styleId="CommentReference">
+  <w:style w:type="character" w:styleId="Kommentarzeichen">
     <w:name w:val="annotation reference"/>
-    <w:basedOn w:val="DefaultParagraphFont"/>
+    <w:basedOn w:val="Absatz-Standardschriftart"/>
     <w:uiPriority w:val="99"/>
     <w:semiHidden/>
     <w:unhideWhenUsed/>
@@ -13926,11 +14010,11 @@
       <w:szCs w:val="16"/>
     </w:rPr>
   </w:style>
-  <w:style w:type="paragraph" w:styleId="CommentSubject">
+  <w:style w:type="paragraph" w:styleId="Kommentarthema">
     <w:name w:val="annotation subject"/>
-    <w:basedOn w:val="CommentText"/>
-    <w:next w:val="CommentText"/>
-    <w:link w:val="CommentSubjectChar"/>
+    <w:basedOn w:val="Kommentartext"/>
+    <w:next w:val="Kommentartext"/>
+    <w:link w:val="KommentarthemaZchn"/>
     <w:uiPriority w:val="99"/>
     <w:semiHidden/>
     <w:unhideWhenUsed/>
@@ -13940,10 +14024,10 @@
       <w:bCs/>
     </w:rPr>
   </w:style>
-  <w:style w:type="character" w:customStyle="1" w:styleId="CommentSubjectChar">
-    <w:name w:val="Comment Subject Char"/>
-    <w:basedOn w:val="CommentTextChar"/>
-    <w:link w:val="CommentSubject"/>
+  <w:style w:type="character" w:customStyle="1" w:styleId="KommentarthemaZchn">
+    <w:name w:val="Kommentarthema Zchn"/>
+    <w:basedOn w:val="KommentartextZchn"/>
+    <w:link w:val="Kommentarthema"/>
     <w:uiPriority w:val="99"/>
     <w:semiHidden/>
     <w:rsid w:val="00CA751D"/>
@@ -13954,9 +14038,9 @@
       <w:szCs w:val="20"/>
     </w:rPr>
   </w:style>
-  <w:style w:type="paragraph" w:styleId="ListParagraph">
+  <w:style w:type="paragraph" w:styleId="Listenabsatz">
     <w:name w:val="List Paragraph"/>
-    <w:basedOn w:val="Normal"/>
+    <w:basedOn w:val="Standard"/>
     <w:uiPriority w:val="34"/>
     <w:qFormat/>
     <w:rsid w:val="00DC1BCB"/>
@@ -13967,7 +14051,7 @@
   </w:style>
   <w:style w:type="character" w:styleId="Hyperlink">
     <w:name w:val="Hyperlink"/>
-    <w:basedOn w:val="DefaultParagraphFont"/>
+    <w:basedOn w:val="Absatz-Standardschriftart"/>
     <w:uiPriority w:val="99"/>
     <w:unhideWhenUsed/>
     <w:rsid w:val="00DC4AFD"/>
@@ -13976,9 +14060,9 @@
       <w:u w:val="single"/>
     </w:rPr>
   </w:style>
-  <w:style w:type="character" w:styleId="UnresolvedMention">
+  <w:style w:type="character" w:styleId="NichtaufgelsteErwhnung">
     <w:name w:val="Unresolved Mention"/>
-    <w:basedOn w:val="DefaultParagraphFont"/>
+    <w:basedOn w:val="Absatz-Standardschriftart"/>
     <w:uiPriority w:val="99"/>
     <w:semiHidden/>
     <w:unhideWhenUsed/>
@@ -13988,9 +14072,9 @@
       <w:shd w:val="clear" w:color="auto" w:fill="E1DFDD"/>
     </w:rPr>
   </w:style>
-  <w:style w:type="table" w:styleId="TableGrid">
+  <w:style w:type="table" w:styleId="Tabellenraster">
     <w:name w:val="Table Grid"/>
-    <w:basedOn w:val="TableNormal"/>
+    <w:basedOn w:val="NormaleTabelle"/>
     <w:uiPriority w:val="39"/>
     <w:rsid w:val="001301B9"/>
     <w:pPr>

</xml_diff>